<commit_message>
Reajusta ponderación de CE en RA1 y reordena el Bloque 1 por prerrequisito práctico
RA1 deja de repartir sus 9 CE a partes iguales: sistema de archivos (CE-f)
y permisos (CE-h) suben de peso por ser prerrequisito constante desde RA5
en adelante; procesos (CE-e) y sistemas transaccionales (CE-i) bajan al
no condicionar directamente ninguna práctica posterior. El resto de RA
mantiene el reparto igualitario. El Bloque 1 se reordena en 6 epígrafes
siguiendo ese mismo criterio (agrupando CE afines: c+d, f+g, b+h) en vez
del orden alfabético de CE.

Co-Authored-By: Claude Sonnet 5 <noreply@anthropic.com>
</commit_message>
<xml_diff>
--- a/criterios-evaluacion/1SMR-SOM-Propuesta_planificacion_y_ponderacion.docx
+++ b/criterios-evaluacion/1SMR-SOM-Propuesta_planificacion_y_ponderacion.docx
@@ -2039,6 +2039,27 @@
         <w:t xml:space="preserve">RA1 (15%) — Reconoce las características de los sistemas operativos analizando sus elementos y funciones.</w:t>
       </w:r>
     </w:p>
+    <w:p>
+      <w:pPr>
+        <w:pBdr>
+          <w:left w:val="single" w:color="CD0063" w:sz="12" w:space="4"/>
+        </w:pBdr>
+        <w:shd w:fill="F2F2F2" w:color="auto" w:val="clear"/>
+        <w:spacing w:after="160"/>
+        <w:ind w:left="100"/>
+      </w:pPr>
+      <w:r>
+        <w:rPr>
+          <w:rFonts w:ascii="News Gothic MT" w:cs="News Gothic MT" w:eastAsia="News Gothic MT" w:hAnsi="News Gothic MT"/>
+          <w:i/>
+          <w:iCs/>
+          <w:color w:val="444444"/>
+          <w:sz w:val="18"/>
+          <w:szCs w:val="18"/>
+        </w:rPr>
+        <w:t xml:space="preserve">A diferencia del resto de RA, los CE de RA1 no se reparten a partes iguales: se ponderan según lo determinantes que son como prerrequisito de los bloques prácticos posteriores (RA5, RA3, RA4). El sistema de archivos (CE-f) y los permisos (CE-h) se usan de forma constante desde el primer bloque práctico, por lo que suben de peso; procesos (CE-e) y sistemas transaccionales (CE-i) se quedan en un nivel conceptual que no condiciona directamente ninguna práctica posterior, por lo que bajan.</w:t>
+      </w:r>
+    </w:p>
     <w:tbl>
       <w:tblPr>
         <w:tblW w:type="dxa" w:w="9100"/>
@@ -2055,6 +2076,7 @@
         <w:gridCol w:w="100"/>
         <w:gridCol w:w="100"/>
         <w:gridCol w:w="100"/>
+        <w:gridCol w:w="100"/>
       </w:tblGrid>
       <w:tr>
         <w:trPr>
@@ -2094,7 +2116,7 @@
         </w:tc>
         <w:tc>
           <w:tcPr>
-            <w:tcW w:type="dxa" w:w="6900"/>
+            <w:tcW w:type="dxa" w:w="5100"/>
             <w:tcBorders>
               <w:top w:val="single" w:color="BFBFBF" w:sz="4"/>
               <w:left w:val="single" w:color="BFBFBF" w:sz="4"/>
@@ -2126,7 +2148,7 @@
         </w:tc>
         <w:tc>
           <w:tcPr>
-            <w:tcW w:type="dxa" w:w="1700"/>
+            <w:tcW w:type="dxa" w:w="1300"/>
             <w:tcBorders>
               <w:top w:val="single" w:color="BFBFBF" w:sz="4"/>
               <w:left w:val="single" w:color="BFBFBF" w:sz="4"/>
@@ -2156,6 +2178,38 @@
             </w:r>
           </w:p>
         </w:tc>
+        <w:tc>
+          <w:tcPr>
+            <w:tcW w:type="dxa" w:w="2200"/>
+            <w:tcBorders>
+              <w:top w:val="single" w:color="BFBFBF" w:sz="4"/>
+              <w:left w:val="single" w:color="BFBFBF" w:sz="4"/>
+              <w:bottom w:val="single" w:color="BFBFBF" w:sz="4"/>
+              <w:right w:val="single" w:color="BFBFBF" w:sz="4"/>
+            </w:tcBorders>
+            <w:shd w:fill="1F3864" w:color="auto" w:val="clear"/>
+            <w:tcMar>
+              <w:top w:type="dxa" w:w="60"/>
+              <w:left w:type="dxa" w:w="100"/>
+              <w:bottom w:type="dxa" w:w="60"/>
+              <w:right w:type="dxa" w:w="100"/>
+            </w:tcMar>
+            <w:vAlign w:val="center"/>
+          </w:tcPr>
+          <w:p>
+            <w:r>
+              <w:rPr>
+                <w:rFonts w:ascii="News Gothic MT" w:cs="News Gothic MT" w:eastAsia="News Gothic MT" w:hAnsi="News Gothic MT"/>
+                <w:b/>
+                <w:bCs/>
+                <w:color w:val="FFFFFF"/>
+                <w:sz w:val="19"/>
+                <w:szCs w:val="19"/>
+              </w:rPr>
+              <w:t xml:space="preserve">Justificación</w:t>
+            </w:r>
+          </w:p>
+        </w:tc>
       </w:tr>
       <w:tr>
         <w:tc>
@@ -2193,7 +2247,7 @@
         </w:tc>
         <w:tc>
           <w:tcPr>
-            <w:tcW w:type="dxa" w:w="6900"/>
+            <w:tcW w:type="dxa" w:w="5100"/>
             <w:tcBorders>
               <w:top w:val="single" w:color="BFBFBF" w:sz="4"/>
               <w:left w:val="single" w:color="BFBFBF" w:sz="4"/>
@@ -2226,34 +2280,67 @@
         </w:tc>
         <w:tc>
           <w:tcPr>
-            <w:tcW w:type="dxa" w:w="1700"/>
-            <w:tcBorders>
-              <w:top w:val="single" w:color="BFBFBF" w:sz="4"/>
-              <w:left w:val="single" w:color="BFBFBF" w:sz="4"/>
-              <w:bottom w:val="single" w:color="BFBFBF" w:sz="4"/>
-              <w:right w:val="single" w:color="BFBFBF" w:sz="4"/>
-            </w:tcBorders>
-            <w:tcMar>
-              <w:top w:type="dxa" w:w="60"/>
-              <w:left w:type="dxa" w:w="100"/>
-              <w:bottom w:type="dxa" w:w="60"/>
-              <w:right w:type="dxa" w:w="100"/>
-            </w:tcMar>
-            <w:vAlign w:val="center"/>
-          </w:tcPr>
-          <w:p>
-            <w:pPr>
-              <w:jc w:val="center"/>
-            </w:pPr>
-            <w:r>
-              <w:rPr>
-                <w:rFonts w:ascii="News Gothic MT" w:cs="News Gothic MT" w:eastAsia="News Gothic MT" w:hAnsi="News Gothic MT"/>
-                <w:b w:val="false"/>
-                <w:bCs w:val="false"/>
-                <w:sz w:val="19"/>
-                <w:szCs w:val="19"/>
-              </w:rPr>
-              <w:t xml:space="preserve">11,11%</w:t>
+            <w:tcW w:type="dxa" w:w="1300"/>
+            <w:tcBorders>
+              <w:top w:val="single" w:color="BFBFBF" w:sz="4"/>
+              <w:left w:val="single" w:color="BFBFBF" w:sz="4"/>
+              <w:bottom w:val="single" w:color="BFBFBF" w:sz="4"/>
+              <w:right w:val="single" w:color="BFBFBF" w:sz="4"/>
+            </w:tcBorders>
+            <w:tcMar>
+              <w:top w:type="dxa" w:w="60"/>
+              <w:left w:type="dxa" w:w="100"/>
+              <w:bottom w:type="dxa" w:w="60"/>
+              <w:right w:type="dxa" w:w="100"/>
+            </w:tcMar>
+            <w:vAlign w:val="center"/>
+          </w:tcPr>
+          <w:p>
+            <w:pPr>
+              <w:jc w:val="center"/>
+            </w:pPr>
+            <w:r>
+              <w:rPr>
+                <w:rFonts w:ascii="News Gothic MT" w:cs="News Gothic MT" w:eastAsia="News Gothic MT" w:hAnsi="News Gothic MT"/>
+                <w:b w:val="false"/>
+                <w:bCs w:val="false"/>
+                <w:sz w:val="19"/>
+                <w:szCs w:val="19"/>
+              </w:rPr>
+              <w:t xml:space="preserve">11,00%</w:t>
+            </w:r>
+          </w:p>
+        </w:tc>
+        <w:tc>
+          <w:tcPr>
+            <w:tcW w:type="dxa" w:w="2200"/>
+            <w:tcBorders>
+              <w:top w:val="single" w:color="BFBFBF" w:sz="4"/>
+              <w:left w:val="single" w:color="BFBFBF" w:sz="4"/>
+              <w:bottom w:val="single" w:color="BFBFBF" w:sz="4"/>
+              <w:right w:val="single" w:color="BFBFBF" w:sz="4"/>
+            </w:tcBorders>
+            <w:tcMar>
+              <w:top w:type="dxa" w:w="60"/>
+              <w:left w:type="dxa" w:w="100"/>
+              <w:bottom w:type="dxa" w:w="60"/>
+              <w:right w:type="dxa" w:w="100"/>
+            </w:tcMar>
+            <w:vAlign w:val="center"/>
+          </w:tcPr>
+          <w:p>
+            <w:pPr>
+              <w:jc w:val="left"/>
+            </w:pPr>
+            <w:r>
+              <w:rPr>
+                <w:rFonts w:ascii="News Gothic MT" w:cs="News Gothic MT" w:eastAsia="News Gothic MT" w:hAnsi="News Gothic MT"/>
+                <w:b w:val="false"/>
+                <w:bCs w:val="false"/>
+                <w:sz w:val="19"/>
+                <w:szCs w:val="19"/>
+              </w:rPr>
+              <w:t xml:space="preserve">Base conceptual de toda la unidad.</w:t>
             </w:r>
           </w:p>
         </w:tc>
@@ -2295,7 +2382,7 @@
         </w:tc>
         <w:tc>
           <w:tcPr>
-            <w:tcW w:type="dxa" w:w="6900"/>
+            <w:tcW w:type="dxa" w:w="5100"/>
             <w:tcBorders>
               <w:top w:val="single" w:color="BFBFBF" w:sz="4"/>
               <w:left w:val="single" w:color="BFBFBF" w:sz="4"/>
@@ -2329,35 +2416,69 @@
         </w:tc>
         <w:tc>
           <w:tcPr>
-            <w:tcW w:type="dxa" w:w="1700"/>
-            <w:tcBorders>
-              <w:top w:val="single" w:color="BFBFBF" w:sz="4"/>
-              <w:left w:val="single" w:color="BFBFBF" w:sz="4"/>
-              <w:bottom w:val="single" w:color="BFBFBF" w:sz="4"/>
-              <w:right w:val="single" w:color="BFBFBF" w:sz="4"/>
-            </w:tcBorders>
-            <w:shd w:fill="F2F2F2" w:color="auto" w:val="clear"/>
-            <w:tcMar>
-              <w:top w:type="dxa" w:w="60"/>
-              <w:left w:type="dxa" w:w="100"/>
-              <w:bottom w:type="dxa" w:w="60"/>
-              <w:right w:type="dxa" w:w="100"/>
-            </w:tcMar>
-            <w:vAlign w:val="center"/>
-          </w:tcPr>
-          <w:p>
-            <w:pPr>
-              <w:jc w:val="center"/>
-            </w:pPr>
-            <w:r>
-              <w:rPr>
-                <w:rFonts w:ascii="News Gothic MT" w:cs="News Gothic MT" w:eastAsia="News Gothic MT" w:hAnsi="News Gothic MT"/>
-                <w:b w:val="false"/>
-                <w:bCs w:val="false"/>
-                <w:sz w:val="19"/>
-                <w:szCs w:val="19"/>
-              </w:rPr>
-              <w:t xml:space="preserve">11,11%</w:t>
+            <w:tcW w:type="dxa" w:w="1300"/>
+            <w:tcBorders>
+              <w:top w:val="single" w:color="BFBFBF" w:sz="4"/>
+              <w:left w:val="single" w:color="BFBFBF" w:sz="4"/>
+              <w:bottom w:val="single" w:color="BFBFBF" w:sz="4"/>
+              <w:right w:val="single" w:color="BFBFBF" w:sz="4"/>
+            </w:tcBorders>
+            <w:shd w:fill="F2F2F2" w:color="auto" w:val="clear"/>
+            <w:tcMar>
+              <w:top w:type="dxa" w:w="60"/>
+              <w:left w:type="dxa" w:w="100"/>
+              <w:bottom w:type="dxa" w:w="60"/>
+              <w:right w:type="dxa" w:w="100"/>
+            </w:tcMar>
+            <w:vAlign w:val="center"/>
+          </w:tcPr>
+          <w:p>
+            <w:pPr>
+              <w:jc w:val="center"/>
+            </w:pPr>
+            <w:r>
+              <w:rPr>
+                <w:rFonts w:ascii="News Gothic MT" w:cs="News Gothic MT" w:eastAsia="News Gothic MT" w:hAnsi="News Gothic MT"/>
+                <w:b w:val="false"/>
+                <w:bCs w:val="false"/>
+                <w:sz w:val="19"/>
+                <w:szCs w:val="19"/>
+              </w:rPr>
+              <w:t xml:space="preserve">11,00%</w:t>
+            </w:r>
+          </w:p>
+        </w:tc>
+        <w:tc>
+          <w:tcPr>
+            <w:tcW w:type="dxa" w:w="2200"/>
+            <w:tcBorders>
+              <w:top w:val="single" w:color="BFBFBF" w:sz="4"/>
+              <w:left w:val="single" w:color="BFBFBF" w:sz="4"/>
+              <w:bottom w:val="single" w:color="BFBFBF" w:sz="4"/>
+              <w:right w:val="single" w:color="BFBFBF" w:sz="4"/>
+            </w:tcBorders>
+            <w:shd w:fill="F2F2F2" w:color="auto" w:val="clear"/>
+            <w:tcMar>
+              <w:top w:type="dxa" w:w="60"/>
+              <w:left w:type="dxa" w:w="100"/>
+              <w:bottom w:type="dxa" w:w="60"/>
+              <w:right w:type="dxa" w:w="100"/>
+            </w:tcMar>
+            <w:vAlign w:val="center"/>
+          </w:tcPr>
+          <w:p>
+            <w:pPr>
+              <w:jc w:val="left"/>
+            </w:pPr>
+            <w:r>
+              <w:rPr>
+                <w:rFonts w:ascii="News Gothic MT" w:cs="News Gothic MT" w:eastAsia="News Gothic MT" w:hAnsi="News Gothic MT"/>
+                <w:b w:val="false"/>
+                <w:bCs w:val="false"/>
+                <w:sz w:val="19"/>
+                <w:szCs w:val="19"/>
+              </w:rPr>
+              <w:t xml:space="preserve">Se enseña junto al CE-h: es su prerrequisito directo.</w:t>
             </w:r>
           </w:p>
         </w:tc>
@@ -2398,7 +2519,7 @@
         </w:tc>
         <w:tc>
           <w:tcPr>
-            <w:tcW w:type="dxa" w:w="6900"/>
+            <w:tcW w:type="dxa" w:w="5100"/>
             <w:tcBorders>
               <w:top w:val="single" w:color="BFBFBF" w:sz="4"/>
               <w:left w:val="single" w:color="BFBFBF" w:sz="4"/>
@@ -2431,34 +2552,67 @@
         </w:tc>
         <w:tc>
           <w:tcPr>
-            <w:tcW w:type="dxa" w:w="1700"/>
-            <w:tcBorders>
-              <w:top w:val="single" w:color="BFBFBF" w:sz="4"/>
-              <w:left w:val="single" w:color="BFBFBF" w:sz="4"/>
-              <w:bottom w:val="single" w:color="BFBFBF" w:sz="4"/>
-              <w:right w:val="single" w:color="BFBFBF" w:sz="4"/>
-            </w:tcBorders>
-            <w:tcMar>
-              <w:top w:type="dxa" w:w="60"/>
-              <w:left w:type="dxa" w:w="100"/>
-              <w:bottom w:type="dxa" w:w="60"/>
-              <w:right w:type="dxa" w:w="100"/>
-            </w:tcMar>
-            <w:vAlign w:val="center"/>
-          </w:tcPr>
-          <w:p>
-            <w:pPr>
-              <w:jc w:val="center"/>
-            </w:pPr>
-            <w:r>
-              <w:rPr>
-                <w:rFonts w:ascii="News Gothic MT" w:cs="News Gothic MT" w:eastAsia="News Gothic MT" w:hAnsi="News Gothic MT"/>
-                <w:b w:val="false"/>
-                <w:bCs w:val="false"/>
-                <w:sz w:val="19"/>
-                <w:szCs w:val="19"/>
-              </w:rPr>
-              <w:t xml:space="preserve">11,11%</w:t>
+            <w:tcW w:type="dxa" w:w="1300"/>
+            <w:tcBorders>
+              <w:top w:val="single" w:color="BFBFBF" w:sz="4"/>
+              <w:left w:val="single" w:color="BFBFBF" w:sz="4"/>
+              <w:bottom w:val="single" w:color="BFBFBF" w:sz="4"/>
+              <w:right w:val="single" w:color="BFBFBF" w:sz="4"/>
+            </w:tcBorders>
+            <w:tcMar>
+              <w:top w:type="dxa" w:w="60"/>
+              <w:left w:type="dxa" w:w="100"/>
+              <w:bottom w:type="dxa" w:w="60"/>
+              <w:right w:type="dxa" w:w="100"/>
+            </w:tcMar>
+            <w:vAlign w:val="center"/>
+          </w:tcPr>
+          <w:p>
+            <w:pPr>
+              <w:jc w:val="center"/>
+            </w:pPr>
+            <w:r>
+              <w:rPr>
+                <w:rFonts w:ascii="News Gothic MT" w:cs="News Gothic MT" w:eastAsia="News Gothic MT" w:hAnsi="News Gothic MT"/>
+                <w:b w:val="false"/>
+                <w:bCs w:val="false"/>
+                <w:sz w:val="19"/>
+                <w:szCs w:val="19"/>
+              </w:rPr>
+              <w:t xml:space="preserve">11,00%</w:t>
+            </w:r>
+          </w:p>
+        </w:tc>
+        <w:tc>
+          <w:tcPr>
+            <w:tcW w:type="dxa" w:w="2200"/>
+            <w:tcBorders>
+              <w:top w:val="single" w:color="BFBFBF" w:sz="4"/>
+              <w:left w:val="single" w:color="BFBFBF" w:sz="4"/>
+              <w:bottom w:val="single" w:color="BFBFBF" w:sz="4"/>
+              <w:right w:val="single" w:color="BFBFBF" w:sz="4"/>
+            </w:tcBorders>
+            <w:tcMar>
+              <w:top w:type="dxa" w:w="60"/>
+              <w:left w:type="dxa" w:w="100"/>
+              <w:bottom w:type="dxa" w:w="60"/>
+              <w:right w:type="dxa" w:w="100"/>
+            </w:tcMar>
+            <w:vAlign w:val="center"/>
+          </w:tcPr>
+          <w:p>
+            <w:pPr>
+              <w:jc w:val="left"/>
+            </w:pPr>
+            <w:r>
+              <w:rPr>
+                <w:rFonts w:ascii="News Gothic MT" w:cs="News Gothic MT" w:eastAsia="News Gothic MT" w:hAnsi="News Gothic MT"/>
+                <w:b w:val="false"/>
+                <w:bCs w:val="false"/>
+                <w:sz w:val="19"/>
+                <w:szCs w:val="19"/>
+              </w:rPr>
+              <w:t xml:space="preserve">Conceptual, necesario para entender b/d/f.</w:t>
             </w:r>
           </w:p>
         </w:tc>
@@ -2500,7 +2654,7 @@
         </w:tc>
         <w:tc>
           <w:tcPr>
-            <w:tcW w:type="dxa" w:w="6900"/>
+            <w:tcW w:type="dxa" w:w="5100"/>
             <w:tcBorders>
               <w:top w:val="single" w:color="BFBFBF" w:sz="4"/>
               <w:left w:val="single" w:color="BFBFBF" w:sz="4"/>
@@ -2534,35 +2688,69 @@
         </w:tc>
         <w:tc>
           <w:tcPr>
-            <w:tcW w:type="dxa" w:w="1700"/>
-            <w:tcBorders>
-              <w:top w:val="single" w:color="BFBFBF" w:sz="4"/>
-              <w:left w:val="single" w:color="BFBFBF" w:sz="4"/>
-              <w:bottom w:val="single" w:color="BFBFBF" w:sz="4"/>
-              <w:right w:val="single" w:color="BFBFBF" w:sz="4"/>
-            </w:tcBorders>
-            <w:shd w:fill="F2F2F2" w:color="auto" w:val="clear"/>
-            <w:tcMar>
-              <w:top w:type="dxa" w:w="60"/>
-              <w:left w:type="dxa" w:w="100"/>
-              <w:bottom w:type="dxa" w:w="60"/>
-              <w:right w:type="dxa" w:w="100"/>
-            </w:tcMar>
-            <w:vAlign w:val="center"/>
-          </w:tcPr>
-          <w:p>
-            <w:pPr>
-              <w:jc w:val="center"/>
-            </w:pPr>
-            <w:r>
-              <w:rPr>
-                <w:rFonts w:ascii="News Gothic MT" w:cs="News Gothic MT" w:eastAsia="News Gothic MT" w:hAnsi="News Gothic MT"/>
-                <w:b w:val="false"/>
-                <w:bCs w:val="false"/>
-                <w:sz w:val="19"/>
-                <w:szCs w:val="19"/>
-              </w:rPr>
-              <w:t xml:space="preserve">11,11%</w:t>
+            <w:tcW w:type="dxa" w:w="1300"/>
+            <w:tcBorders>
+              <w:top w:val="single" w:color="BFBFBF" w:sz="4"/>
+              <w:left w:val="single" w:color="BFBFBF" w:sz="4"/>
+              <w:bottom w:val="single" w:color="BFBFBF" w:sz="4"/>
+              <w:right w:val="single" w:color="BFBFBF" w:sz="4"/>
+            </w:tcBorders>
+            <w:shd w:fill="F2F2F2" w:color="auto" w:val="clear"/>
+            <w:tcMar>
+              <w:top w:type="dxa" w:w="60"/>
+              <w:left w:type="dxa" w:w="100"/>
+              <w:bottom w:type="dxa" w:w="60"/>
+              <w:right w:type="dxa" w:w="100"/>
+            </w:tcMar>
+            <w:vAlign w:val="center"/>
+          </w:tcPr>
+          <w:p>
+            <w:pPr>
+              <w:jc w:val="center"/>
+            </w:pPr>
+            <w:r>
+              <w:rPr>
+                <w:rFonts w:ascii="News Gothic MT" w:cs="News Gothic MT" w:eastAsia="News Gothic MT" w:hAnsi="News Gothic MT"/>
+                <w:b w:val="false"/>
+                <w:bCs w:val="false"/>
+                <w:sz w:val="19"/>
+                <w:szCs w:val="19"/>
+              </w:rPr>
+              <w:t xml:space="preserve">11,00%</w:t>
+            </w:r>
+          </w:p>
+        </w:tc>
+        <w:tc>
+          <w:tcPr>
+            <w:tcW w:type="dxa" w:w="2200"/>
+            <w:tcBorders>
+              <w:top w:val="single" w:color="BFBFBF" w:sz="4"/>
+              <w:left w:val="single" w:color="BFBFBF" w:sz="4"/>
+              <w:bottom w:val="single" w:color="BFBFBF" w:sz="4"/>
+              <w:right w:val="single" w:color="BFBFBF" w:sz="4"/>
+            </w:tcBorders>
+            <w:shd w:fill="F2F2F2" w:color="auto" w:val="clear"/>
+            <w:tcMar>
+              <w:top w:type="dxa" w:w="60"/>
+              <w:left w:type="dxa" w:w="100"/>
+              <w:bottom w:type="dxa" w:w="60"/>
+              <w:right w:type="dxa" w:w="100"/>
+            </w:tcMar>
+            <w:vAlign w:val="center"/>
+          </w:tcPr>
+          <w:p>
+            <w:pPr>
+              <w:jc w:val="left"/>
+            </w:pPr>
+            <w:r>
+              <w:rPr>
+                <w:rFonts w:ascii="News Gothic MT" w:cs="News Gothic MT" w:eastAsia="News Gothic MT" w:hAnsi="News Gothic MT"/>
+                <w:b w:val="false"/>
+                <w:bCs w:val="false"/>
+                <w:sz w:val="19"/>
+                <w:szCs w:val="19"/>
+              </w:rPr>
+              <w:t xml:space="preserve">Da el vocabulario (núcleo, shell, drivers) usado en RA3.</w:t>
             </w:r>
           </w:p>
         </w:tc>
@@ -2603,7 +2791,7 @@
         </w:tc>
         <w:tc>
           <w:tcPr>
-            <w:tcW w:type="dxa" w:w="6900"/>
+            <w:tcW w:type="dxa" w:w="5100"/>
             <w:tcBorders>
               <w:top w:val="single" w:color="BFBFBF" w:sz="4"/>
               <w:left w:val="single" w:color="BFBFBF" w:sz="4"/>
@@ -2636,34 +2824,67 @@
         </w:tc>
         <w:tc>
           <w:tcPr>
-            <w:tcW w:type="dxa" w:w="1700"/>
-            <w:tcBorders>
-              <w:top w:val="single" w:color="BFBFBF" w:sz="4"/>
-              <w:left w:val="single" w:color="BFBFBF" w:sz="4"/>
-              <w:bottom w:val="single" w:color="BFBFBF" w:sz="4"/>
-              <w:right w:val="single" w:color="BFBFBF" w:sz="4"/>
-            </w:tcBorders>
-            <w:tcMar>
-              <w:top w:type="dxa" w:w="60"/>
-              <w:left w:type="dxa" w:w="100"/>
-              <w:bottom w:type="dxa" w:w="60"/>
-              <w:right w:type="dxa" w:w="100"/>
-            </w:tcMar>
-            <w:vAlign w:val="center"/>
-          </w:tcPr>
-          <w:p>
-            <w:pPr>
-              <w:jc w:val="center"/>
-            </w:pPr>
-            <w:r>
-              <w:rPr>
-                <w:rFonts w:ascii="News Gothic MT" w:cs="News Gothic MT" w:eastAsia="News Gothic MT" w:hAnsi="News Gothic MT"/>
-                <w:b w:val="false"/>
-                <w:bCs w:val="false"/>
-                <w:sz w:val="19"/>
-                <w:szCs w:val="19"/>
-              </w:rPr>
-              <w:t xml:space="preserve">11,11%</w:t>
+            <w:tcW w:type="dxa" w:w="1300"/>
+            <w:tcBorders>
+              <w:top w:val="single" w:color="BFBFBF" w:sz="4"/>
+              <w:left w:val="single" w:color="BFBFBF" w:sz="4"/>
+              <w:bottom w:val="single" w:color="BFBFBF" w:sz="4"/>
+              <w:right w:val="single" w:color="BFBFBF" w:sz="4"/>
+            </w:tcBorders>
+            <w:tcMar>
+              <w:top w:type="dxa" w:w="60"/>
+              <w:left w:type="dxa" w:w="100"/>
+              <w:bottom w:type="dxa" w:w="60"/>
+              <w:right w:type="dxa" w:w="100"/>
+            </w:tcMar>
+            <w:vAlign w:val="center"/>
+          </w:tcPr>
+          <w:p>
+            <w:pPr>
+              <w:jc w:val="center"/>
+            </w:pPr>
+            <w:r>
+              <w:rPr>
+                <w:rFonts w:ascii="News Gothic MT" w:cs="News Gothic MT" w:eastAsia="News Gothic MT" w:hAnsi="News Gothic MT"/>
+                <w:b w:val="false"/>
+                <w:bCs w:val="false"/>
+                <w:sz w:val="19"/>
+                <w:szCs w:val="19"/>
+              </w:rPr>
+              <w:t xml:space="preserve">8,00%</w:t>
+            </w:r>
+          </w:p>
+        </w:tc>
+        <w:tc>
+          <w:tcPr>
+            <w:tcW w:type="dxa" w:w="2200"/>
+            <w:tcBorders>
+              <w:top w:val="single" w:color="BFBFBF" w:sz="4"/>
+              <w:left w:val="single" w:color="BFBFBF" w:sz="4"/>
+              <w:bottom w:val="single" w:color="BFBFBF" w:sz="4"/>
+              <w:right w:val="single" w:color="BFBFBF" w:sz="4"/>
+            </w:tcBorders>
+            <w:tcMar>
+              <w:top w:type="dxa" w:w="60"/>
+              <w:left w:type="dxa" w:w="100"/>
+              <w:bottom w:type="dxa" w:w="60"/>
+              <w:right w:type="dxa" w:w="100"/>
+            </w:tcMar>
+            <w:vAlign w:val="center"/>
+          </w:tcPr>
+          <w:p>
+            <w:pPr>
+              <w:jc w:val="left"/>
+            </w:pPr>
+            <w:r>
+              <w:rPr>
+                <w:rFonts w:ascii="News Gothic MT" w:cs="News Gothic MT" w:eastAsia="News Gothic MT" w:hAnsi="News Gothic MT"/>
+                <w:b w:val="false"/>
+                <w:bCs w:val="false"/>
+                <w:sz w:val="19"/>
+                <w:szCs w:val="19"/>
+              </w:rPr>
+              <w:t xml:space="preserve">Nivel conceptual; se retoma con herramientas reales en RA4.</w:t>
             </w:r>
           </w:p>
         </w:tc>
@@ -2705,7 +2926,7 @@
         </w:tc>
         <w:tc>
           <w:tcPr>
-            <w:tcW w:type="dxa" w:w="6900"/>
+            <w:tcW w:type="dxa" w:w="5100"/>
             <w:tcBorders>
               <w:top w:val="single" w:color="BFBFBF" w:sz="4"/>
               <w:left w:val="single" w:color="BFBFBF" w:sz="4"/>
@@ -2739,35 +2960,69 @@
         </w:tc>
         <w:tc>
           <w:tcPr>
-            <w:tcW w:type="dxa" w:w="1700"/>
-            <w:tcBorders>
-              <w:top w:val="single" w:color="BFBFBF" w:sz="4"/>
-              <w:left w:val="single" w:color="BFBFBF" w:sz="4"/>
-              <w:bottom w:val="single" w:color="BFBFBF" w:sz="4"/>
-              <w:right w:val="single" w:color="BFBFBF" w:sz="4"/>
-            </w:tcBorders>
-            <w:shd w:fill="F2F2F2" w:color="auto" w:val="clear"/>
-            <w:tcMar>
-              <w:top w:type="dxa" w:w="60"/>
-              <w:left w:type="dxa" w:w="100"/>
-              <w:bottom w:type="dxa" w:w="60"/>
-              <w:right w:type="dxa" w:w="100"/>
-            </w:tcMar>
-            <w:vAlign w:val="center"/>
-          </w:tcPr>
-          <w:p>
-            <w:pPr>
-              <w:jc w:val="center"/>
-            </w:pPr>
-            <w:r>
-              <w:rPr>
-                <w:rFonts w:ascii="News Gothic MT" w:cs="News Gothic MT" w:eastAsia="News Gothic MT" w:hAnsi="News Gothic MT"/>
-                <w:b w:val="false"/>
-                <w:bCs w:val="false"/>
-                <w:sz w:val="19"/>
-                <w:szCs w:val="19"/>
-              </w:rPr>
-              <w:t xml:space="preserve">11,11%</w:t>
+            <w:tcW w:type="dxa" w:w="1300"/>
+            <w:tcBorders>
+              <w:top w:val="single" w:color="BFBFBF" w:sz="4"/>
+              <w:left w:val="single" w:color="BFBFBF" w:sz="4"/>
+              <w:bottom w:val="single" w:color="BFBFBF" w:sz="4"/>
+              <w:right w:val="single" w:color="BFBFBF" w:sz="4"/>
+            </w:tcBorders>
+            <w:shd w:fill="F2F2F2" w:color="auto" w:val="clear"/>
+            <w:tcMar>
+              <w:top w:type="dxa" w:w="60"/>
+              <w:left w:type="dxa" w:w="100"/>
+              <w:bottom w:type="dxa" w:w="60"/>
+              <w:right w:type="dxa" w:w="100"/>
+            </w:tcMar>
+            <w:vAlign w:val="center"/>
+          </w:tcPr>
+          <w:p>
+            <w:pPr>
+              <w:jc w:val="center"/>
+            </w:pPr>
+            <w:r>
+              <w:rPr>
+                <w:rFonts w:ascii="News Gothic MT" w:cs="News Gothic MT" w:eastAsia="News Gothic MT" w:hAnsi="News Gothic MT"/>
+                <w:b w:val="false"/>
+                <w:bCs w:val="false"/>
+                <w:sz w:val="19"/>
+                <w:szCs w:val="19"/>
+              </w:rPr>
+              <w:t xml:space="preserve">16,00%</w:t>
+            </w:r>
+          </w:p>
+        </w:tc>
+        <w:tc>
+          <w:tcPr>
+            <w:tcW w:type="dxa" w:w="2200"/>
+            <w:tcBorders>
+              <w:top w:val="single" w:color="BFBFBF" w:sz="4"/>
+              <w:left w:val="single" w:color="BFBFBF" w:sz="4"/>
+              <w:bottom w:val="single" w:color="BFBFBF" w:sz="4"/>
+              <w:right w:val="single" w:color="BFBFBF" w:sz="4"/>
+            </w:tcBorders>
+            <w:shd w:fill="F2F2F2" w:color="auto" w:val="clear"/>
+            <w:tcMar>
+              <w:top w:type="dxa" w:w="60"/>
+              <w:left w:type="dxa" w:w="100"/>
+              <w:bottom w:type="dxa" w:w="60"/>
+              <w:right w:type="dxa" w:w="100"/>
+            </w:tcMar>
+            <w:vAlign w:val="center"/>
+          </w:tcPr>
+          <w:p>
+            <w:pPr>
+              <w:jc w:val="left"/>
+            </w:pPr>
+            <w:r>
+              <w:rPr>
+                <w:rFonts w:ascii="News Gothic MT" w:cs="News Gothic MT" w:eastAsia="News Gothic MT" w:hAnsi="News Gothic MT"/>
+                <w:b w:val="false"/>
+                <w:bCs w:val="false"/>
+                <w:sz w:val="19"/>
+                <w:szCs w:val="19"/>
+              </w:rPr>
+              <w:t xml:space="preserve">Prerrequisito directo y constante desde RA5 en adelante.</w:t>
             </w:r>
           </w:p>
         </w:tc>
@@ -2808,7 +3063,7 @@
         </w:tc>
         <w:tc>
           <w:tcPr>
-            <w:tcW w:type="dxa" w:w="6900"/>
+            <w:tcW w:type="dxa" w:w="5100"/>
             <w:tcBorders>
               <w:top w:val="single" w:color="BFBFBF" w:sz="4"/>
               <w:left w:val="single" w:color="BFBFBF" w:sz="4"/>
@@ -2841,34 +3096,67 @@
         </w:tc>
         <w:tc>
           <w:tcPr>
-            <w:tcW w:type="dxa" w:w="1700"/>
-            <w:tcBorders>
-              <w:top w:val="single" w:color="BFBFBF" w:sz="4"/>
-              <w:left w:val="single" w:color="BFBFBF" w:sz="4"/>
-              <w:bottom w:val="single" w:color="BFBFBF" w:sz="4"/>
-              <w:right w:val="single" w:color="BFBFBF" w:sz="4"/>
-            </w:tcBorders>
-            <w:tcMar>
-              <w:top w:type="dxa" w:w="60"/>
-              <w:left w:type="dxa" w:w="100"/>
-              <w:bottom w:type="dxa" w:w="60"/>
-              <w:right w:type="dxa" w:w="100"/>
-            </w:tcMar>
-            <w:vAlign w:val="center"/>
-          </w:tcPr>
-          <w:p>
-            <w:pPr>
-              <w:jc w:val="center"/>
-            </w:pPr>
-            <w:r>
-              <w:rPr>
-                <w:rFonts w:ascii="News Gothic MT" w:cs="News Gothic MT" w:eastAsia="News Gothic MT" w:hAnsi="News Gothic MT"/>
-                <w:b w:val="false"/>
-                <w:bCs w:val="false"/>
-                <w:sz w:val="19"/>
-                <w:szCs w:val="19"/>
-              </w:rPr>
-              <w:t xml:space="preserve">11,11%</w:t>
+            <w:tcW w:type="dxa" w:w="1300"/>
+            <w:tcBorders>
+              <w:top w:val="single" w:color="BFBFBF" w:sz="4"/>
+              <w:left w:val="single" w:color="BFBFBF" w:sz="4"/>
+              <w:bottom w:val="single" w:color="BFBFBF" w:sz="4"/>
+              <w:right w:val="single" w:color="BFBFBF" w:sz="4"/>
+            </w:tcBorders>
+            <w:tcMar>
+              <w:top w:type="dxa" w:w="60"/>
+              <w:left w:type="dxa" w:w="100"/>
+              <w:bottom w:type="dxa" w:w="60"/>
+              <w:right w:type="dxa" w:w="100"/>
+            </w:tcMar>
+            <w:vAlign w:val="center"/>
+          </w:tcPr>
+          <w:p>
+            <w:pPr>
+              <w:jc w:val="center"/>
+            </w:pPr>
+            <w:r>
+              <w:rPr>
+                <w:rFonts w:ascii="News Gothic MT" w:cs="News Gothic MT" w:eastAsia="News Gothic MT" w:hAnsi="News Gothic MT"/>
+                <w:b w:val="false"/>
+                <w:bCs w:val="false"/>
+                <w:sz w:val="19"/>
+                <w:szCs w:val="19"/>
+              </w:rPr>
+              <w:t xml:space="preserve">9,00%</w:t>
+            </w:r>
+          </w:p>
+        </w:tc>
+        <w:tc>
+          <w:tcPr>
+            <w:tcW w:type="dxa" w:w="2200"/>
+            <w:tcBorders>
+              <w:top w:val="single" w:color="BFBFBF" w:sz="4"/>
+              <w:left w:val="single" w:color="BFBFBF" w:sz="4"/>
+              <w:bottom w:val="single" w:color="BFBFBF" w:sz="4"/>
+              <w:right w:val="single" w:color="BFBFBF" w:sz="4"/>
+            </w:tcBorders>
+            <w:tcMar>
+              <w:top w:type="dxa" w:w="60"/>
+              <w:left w:type="dxa" w:w="100"/>
+              <w:bottom w:type="dxa" w:w="60"/>
+              <w:right w:type="dxa" w:w="100"/>
+            </w:tcMar>
+            <w:vAlign w:val="center"/>
+          </w:tcPr>
+          <w:p>
+            <w:pPr>
+              <w:jc w:val="left"/>
+            </w:pPr>
+            <w:r>
+              <w:rPr>
+                <w:rFonts w:ascii="News Gothic MT" w:cs="News Gothic MT" w:eastAsia="News Gothic MT" w:hAnsi="News Gothic MT"/>
+                <w:b w:val="false"/>
+                <w:bCs w:val="false"/>
+                <w:sz w:val="19"/>
+                <w:szCs w:val="19"/>
+              </w:rPr>
+              <w:t xml:space="preserve">Descriptivo, va a rueda del CE-f.</w:t>
             </w:r>
           </w:p>
         </w:tc>
@@ -2910,7 +3198,7 @@
         </w:tc>
         <w:tc>
           <w:tcPr>
-            <w:tcW w:type="dxa" w:w="6900"/>
+            <w:tcW w:type="dxa" w:w="5100"/>
             <w:tcBorders>
               <w:top w:val="single" w:color="BFBFBF" w:sz="4"/>
               <w:left w:val="single" w:color="BFBFBF" w:sz="4"/>
@@ -2944,35 +3232,69 @@
         </w:tc>
         <w:tc>
           <w:tcPr>
-            <w:tcW w:type="dxa" w:w="1700"/>
-            <w:tcBorders>
-              <w:top w:val="single" w:color="BFBFBF" w:sz="4"/>
-              <w:left w:val="single" w:color="BFBFBF" w:sz="4"/>
-              <w:bottom w:val="single" w:color="BFBFBF" w:sz="4"/>
-              <w:right w:val="single" w:color="BFBFBF" w:sz="4"/>
-            </w:tcBorders>
-            <w:shd w:fill="F2F2F2" w:color="auto" w:val="clear"/>
-            <w:tcMar>
-              <w:top w:type="dxa" w:w="60"/>
-              <w:left w:type="dxa" w:w="100"/>
-              <w:bottom w:type="dxa" w:w="60"/>
-              <w:right w:type="dxa" w:w="100"/>
-            </w:tcMar>
-            <w:vAlign w:val="center"/>
-          </w:tcPr>
-          <w:p>
-            <w:pPr>
-              <w:jc w:val="center"/>
-            </w:pPr>
-            <w:r>
-              <w:rPr>
-                <w:rFonts w:ascii="News Gothic MT" w:cs="News Gothic MT" w:eastAsia="News Gothic MT" w:hAnsi="News Gothic MT"/>
-                <w:b w:val="false"/>
-                <w:bCs w:val="false"/>
-                <w:sz w:val="19"/>
-                <w:szCs w:val="19"/>
-              </w:rPr>
-              <w:t xml:space="preserve">11,11%</w:t>
+            <w:tcW w:type="dxa" w:w="1300"/>
+            <w:tcBorders>
+              <w:top w:val="single" w:color="BFBFBF" w:sz="4"/>
+              <w:left w:val="single" w:color="BFBFBF" w:sz="4"/>
+              <w:bottom w:val="single" w:color="BFBFBF" w:sz="4"/>
+              <w:right w:val="single" w:color="BFBFBF" w:sz="4"/>
+            </w:tcBorders>
+            <w:shd w:fill="F2F2F2" w:color="auto" w:val="clear"/>
+            <w:tcMar>
+              <w:top w:type="dxa" w:w="60"/>
+              <w:left w:type="dxa" w:w="100"/>
+              <w:bottom w:type="dxa" w:w="60"/>
+              <w:right w:type="dxa" w:w="100"/>
+            </w:tcMar>
+            <w:vAlign w:val="center"/>
+          </w:tcPr>
+          <w:p>
+            <w:pPr>
+              <w:jc w:val="center"/>
+            </w:pPr>
+            <w:r>
+              <w:rPr>
+                <w:rFonts w:ascii="News Gothic MT" w:cs="News Gothic MT" w:eastAsia="News Gothic MT" w:hAnsi="News Gothic MT"/>
+                <w:b w:val="false"/>
+                <w:bCs w:val="false"/>
+                <w:sz w:val="19"/>
+                <w:szCs w:val="19"/>
+              </w:rPr>
+              <w:t xml:space="preserve">16,00%</w:t>
+            </w:r>
+          </w:p>
+        </w:tc>
+        <w:tc>
+          <w:tcPr>
+            <w:tcW w:type="dxa" w:w="2200"/>
+            <w:tcBorders>
+              <w:top w:val="single" w:color="BFBFBF" w:sz="4"/>
+              <w:left w:val="single" w:color="BFBFBF" w:sz="4"/>
+              <w:bottom w:val="single" w:color="BFBFBF" w:sz="4"/>
+              <w:right w:val="single" w:color="BFBFBF" w:sz="4"/>
+            </w:tcBorders>
+            <w:shd w:fill="F2F2F2" w:color="auto" w:val="clear"/>
+            <w:tcMar>
+              <w:top w:type="dxa" w:w="60"/>
+              <w:left w:type="dxa" w:w="100"/>
+              <w:bottom w:type="dxa" w:w="60"/>
+              <w:right w:type="dxa" w:w="100"/>
+            </w:tcMar>
+            <w:vAlign w:val="center"/>
+          </w:tcPr>
+          <w:p>
+            <w:pPr>
+              <w:jc w:val="left"/>
+            </w:pPr>
+            <w:r>
+              <w:rPr>
+                <w:rFonts w:ascii="News Gothic MT" w:cs="News Gothic MT" w:eastAsia="News Gothic MT" w:hAnsi="News Gothic MT"/>
+                <w:b w:val="false"/>
+                <w:bCs w:val="false"/>
+                <w:sz w:val="19"/>
+                <w:szCs w:val="19"/>
+              </w:rPr>
+              <w:t xml:space="preserve">Prerrequisito directo de RA4 (chmod/chown, NTFS).</w:t>
             </w:r>
           </w:p>
         </w:tc>
@@ -3013,7 +3335,7 @@
         </w:tc>
         <w:tc>
           <w:tcPr>
-            <w:tcW w:type="dxa" w:w="6900"/>
+            <w:tcW w:type="dxa" w:w="5100"/>
             <w:tcBorders>
               <w:top w:val="single" w:color="BFBFBF" w:sz="4"/>
               <w:left w:val="single" w:color="BFBFBF" w:sz="4"/>
@@ -3046,34 +3368,67 @@
         </w:tc>
         <w:tc>
           <w:tcPr>
-            <w:tcW w:type="dxa" w:w="1700"/>
-            <w:tcBorders>
-              <w:top w:val="single" w:color="BFBFBF" w:sz="4"/>
-              <w:left w:val="single" w:color="BFBFBF" w:sz="4"/>
-              <w:bottom w:val="single" w:color="BFBFBF" w:sz="4"/>
-              <w:right w:val="single" w:color="BFBFBF" w:sz="4"/>
-            </w:tcBorders>
-            <w:tcMar>
-              <w:top w:type="dxa" w:w="60"/>
-              <w:left w:type="dxa" w:w="100"/>
-              <w:bottom w:type="dxa" w:w="60"/>
-              <w:right w:type="dxa" w:w="100"/>
-            </w:tcMar>
-            <w:vAlign w:val="center"/>
-          </w:tcPr>
-          <w:p>
-            <w:pPr>
-              <w:jc w:val="center"/>
-            </w:pPr>
-            <w:r>
-              <w:rPr>
-                <w:rFonts w:ascii="News Gothic MT" w:cs="News Gothic MT" w:eastAsia="News Gothic MT" w:hAnsi="News Gothic MT"/>
-                <w:b w:val="false"/>
-                <w:bCs w:val="false"/>
-                <w:sz w:val="19"/>
-                <w:szCs w:val="19"/>
-              </w:rPr>
-              <w:t xml:space="preserve">11,12%</w:t>
+            <w:tcW w:type="dxa" w:w="1300"/>
+            <w:tcBorders>
+              <w:top w:val="single" w:color="BFBFBF" w:sz="4"/>
+              <w:left w:val="single" w:color="BFBFBF" w:sz="4"/>
+              <w:bottom w:val="single" w:color="BFBFBF" w:sz="4"/>
+              <w:right w:val="single" w:color="BFBFBF" w:sz="4"/>
+            </w:tcBorders>
+            <w:tcMar>
+              <w:top w:type="dxa" w:w="60"/>
+              <w:left w:type="dxa" w:w="100"/>
+              <w:bottom w:type="dxa" w:w="60"/>
+              <w:right w:type="dxa" w:w="100"/>
+            </w:tcMar>
+            <w:vAlign w:val="center"/>
+          </w:tcPr>
+          <w:p>
+            <w:pPr>
+              <w:jc w:val="center"/>
+            </w:pPr>
+            <w:r>
+              <w:rPr>
+                <w:rFonts w:ascii="News Gothic MT" w:cs="News Gothic MT" w:eastAsia="News Gothic MT" w:hAnsi="News Gothic MT"/>
+                <w:b w:val="false"/>
+                <w:bCs w:val="false"/>
+                <w:sz w:val="19"/>
+                <w:szCs w:val="19"/>
+              </w:rPr>
+              <w:t xml:space="preserve">7,00%</w:t>
+            </w:r>
+          </w:p>
+        </w:tc>
+        <w:tc>
+          <w:tcPr>
+            <w:tcW w:type="dxa" w:w="2200"/>
+            <w:tcBorders>
+              <w:top w:val="single" w:color="BFBFBF" w:sz="4"/>
+              <w:left w:val="single" w:color="BFBFBF" w:sz="4"/>
+              <w:bottom w:val="single" w:color="BFBFBF" w:sz="4"/>
+              <w:right w:val="single" w:color="BFBFBF" w:sz="4"/>
+            </w:tcBorders>
+            <w:tcMar>
+              <w:top w:type="dxa" w:w="60"/>
+              <w:left w:type="dxa" w:w="100"/>
+              <w:bottom w:type="dxa" w:w="60"/>
+              <w:right w:type="dxa" w:w="100"/>
+            </w:tcMar>
+            <w:vAlign w:val="center"/>
+          </w:tcPr>
+          <w:p>
+            <w:pPr>
+              <w:jc w:val="left"/>
+            </w:pPr>
+            <w:r>
+              <w:rPr>
+                <w:rFonts w:ascii="News Gothic MT" w:cs="News Gothic MT" w:eastAsia="News Gothic MT" w:hAnsi="News Gothic MT"/>
+                <w:b w:val="false"/>
+                <w:bCs w:val="false"/>
+                <w:sz w:val="19"/>
+                <w:szCs w:val="19"/>
+              </w:rPr>
+              <w:t xml:space="preserve">El que menos condiciona la parte práctica posterior.</w:t>
             </w:r>
           </w:p>
         </w:tc>
@@ -7247,6 +7602,23 @@
         <w:t xml:space="preserve">Bloque 1 — RA1: Fundamentos simplificados</w:t>
       </w:r>
     </w:p>
+    <w:p>
+      <w:pPr>
+        <w:spacing w:after="160"/>
+      </w:pPr>
+      <w:r>
+        <w:rPr>
+          <w:rFonts w:ascii="News Gothic MT" w:cs="News Gothic MT" w:eastAsia="News Gothic MT" w:hAnsi="News Gothic MT"/>
+          <w:b w:val="false"/>
+          <w:bCs w:val="false"/>
+          <w:i w:val="false"/>
+          <w:iCs w:val="false"/>
+          <w:sz w:val="20"/>
+          <w:szCs w:val="20"/>
+        </w:rPr>
+        <w:t xml:space="preserve">Secuencia interna de la unidad (UD01), reagrupada por peso como prerrequisito de los bloques prácticos posteriores, no por orden alfabético de CE: el sistema de archivos y los permisos, que se usan de forma constante desde RA5 en adelante, se sitúan como núcleo de la unidad; procesos y sistemas transaccionales, que no condicionan directamente ninguna práctica posterior, quedan como bloques breves de nivel conceptual.</w:t>
+      </w:r>
+    </w:p>
     <w:tbl>
       <w:tblPr>
         <w:tblW w:type="dxa" w:w="9100"/>
@@ -7301,7 +7673,7 @@
         </w:tc>
         <w:tc>
           <w:tcPr>
-            <w:tcW w:type="dxa" w:w="7800"/>
+            <w:tcW w:type="dxa" w:w="7000"/>
             <w:tcBorders>
               <w:top w:val="single" w:color="BFBFBF" w:sz="4"/>
               <w:left w:val="single" w:color="BFBFBF" w:sz="4"/>
@@ -7362,13 +7734,13 @@
                 <w:sz w:val="19"/>
                 <w:szCs w:val="19"/>
               </w:rPr>
-              <w:t xml:space="preserve">a)</w:t>
-            </w:r>
-          </w:p>
-        </w:tc>
-        <w:tc>
-          <w:tcPr>
-            <w:tcW w:type="dxa" w:w="7800"/>
+              <w:t xml:space="preserve">1. (a)</w:t>
+            </w:r>
+          </w:p>
+        </w:tc>
+        <w:tc>
+          <w:tcPr>
+            <w:tcW w:type="dxa" w:w="7000"/>
             <w:tcBorders>
               <w:top w:val="single" w:color="BFBFBF" w:sz="4"/>
               <w:left w:val="single" w:color="BFBFBF" w:sz="4"/>
@@ -7395,7 +7767,7 @@
                 <w:sz w:val="19"/>
                 <w:szCs w:val="19"/>
               </w:rPr>
-              <w:t xml:space="preserve">Concepto de sistema informático (hardware, software, usuarios y su relación); software de base frente a software de aplicación; niveles del sistema informático (hardware → software de base → lenguajes/entornos → software de aplicación → usuario); lenguajes de programación: concepto general y ubicación en el modelo de niveles (máquina, ensamblador, alto nivel), sin sintaxis ni programación real.</w:t>
+              <w:t xml:space="preserve">El sistema informático y el software: hardware, software, usuarios y su relación; software de base frente a software de aplicación; niveles del sistema informático (hardware → software de base → lenguajes/entornos → software de aplicación → usuario); lenguajes de programación: concepto general y ubicación en el modelo de niveles (máquina, ensamblador, alto nivel), sin sintaxis ni programación real.</w:t>
             </w:r>
           </w:p>
         </w:tc>
@@ -7431,13 +7803,13 @@
                 <w:sz w:val="19"/>
                 <w:szCs w:val="19"/>
               </w:rPr>
-              <w:t xml:space="preserve">b)</w:t>
-            </w:r>
-          </w:p>
-        </w:tc>
-        <w:tc>
-          <w:tcPr>
-            <w:tcW w:type="dxa" w:w="7800"/>
+              <w:t xml:space="preserve">2. (c+d)</w:t>
+            </w:r>
+          </w:p>
+        </w:tc>
+        <w:tc>
+          <w:tcPr>
+            <w:tcW w:type="dxa" w:w="7000"/>
             <w:tcBorders>
               <w:top w:val="single" w:color="BFBFBF" w:sz="4"/>
               <w:left w:val="single" w:color="BFBFBF" w:sz="4"/>
@@ -7465,7 +7837,7 @@
                 <w:sz w:val="19"/>
                 <w:szCs w:val="19"/>
               </w:rPr>
-              <w:t xml:space="preserve">Representación de la información limitada a lo necesario para permisos: sistema binario y octal.</w:t>
+              <w:t xml:space="preserve">Funciones y arquitectura del sistema operativo: gestión de procesos, memoria, archivos y entrada/salida (sin algoritmos), organizadas según la arquitectura por capas (núcleo, controladores, shell, aplicaciones); comparación Windows/Linux a alto nivel.</w:t>
             </w:r>
           </w:p>
         </w:tc>
@@ -7500,13 +7872,13 @@
                 <w:sz w:val="19"/>
                 <w:szCs w:val="19"/>
               </w:rPr>
-              <w:t xml:space="preserve">c)</w:t>
-            </w:r>
-          </w:p>
-        </w:tc>
-        <w:tc>
-          <w:tcPr>
-            <w:tcW w:type="dxa" w:w="7800"/>
+              <w:t xml:space="preserve">3. (e)</w:t>
+            </w:r>
+          </w:p>
+        </w:tc>
+        <w:tc>
+          <w:tcPr>
+            <w:tcW w:type="dxa" w:w="7000"/>
             <w:tcBorders>
               <w:top w:val="single" w:color="BFBFBF" w:sz="4"/>
               <w:left w:val="single" w:color="BFBFBF" w:sz="4"/>
@@ -7533,7 +7905,7 @@
                 <w:sz w:val="19"/>
                 <w:szCs w:val="19"/>
               </w:rPr>
-              <w:t xml:space="preserve">Funciones del sistema operativo (gestión de procesos, memoria, archivos, entrada/salida), sin algoritmos de planificación.</w:t>
+              <w:t xml:space="preserve">Procesos y sus estados: concepto, sin planificadores ni algoritmos — se retoma con herramientas reales (ps/top, Administrador de tareas) en RA4.</w:t>
             </w:r>
           </w:p>
         </w:tc>
@@ -7569,13 +7941,13 @@
                 <w:sz w:val="19"/>
                 <w:szCs w:val="19"/>
               </w:rPr>
-              <w:t xml:space="preserve">d)</w:t>
-            </w:r>
-          </w:p>
-        </w:tc>
-        <w:tc>
-          <w:tcPr>
-            <w:tcW w:type="dxa" w:w="7800"/>
+              <w:t xml:space="preserve">4. (f+g)</w:t>
+            </w:r>
+          </w:p>
+        </w:tc>
+        <w:tc>
+          <w:tcPr>
+            <w:tcW w:type="dxa" w:w="7000"/>
             <w:tcBorders>
               <w:top w:val="single" w:color="BFBFBF" w:sz="4"/>
               <w:left w:val="single" w:color="BFBFBF" w:sz="4"/>
@@ -7603,7 +7975,7 @@
                 <w:sz w:val="19"/>
                 <w:szCs w:val="19"/>
               </w:rPr>
-              <w:t xml:space="preserve">Arquitectura del sistema operativo por capas (núcleo, controladores, shell, aplicaciones), comparando Windows y Linux a alto nivel.</w:t>
+              <w:t xml:space="preserve">Sistema de archivos: organización y atributos. Estructura y jerarquía, rutas, atributos de archivo y directorio en Windows y Linux.</w:t>
             </w:r>
           </w:p>
         </w:tc>
@@ -7638,13 +8010,13 @@
                 <w:sz w:val="19"/>
                 <w:szCs w:val="19"/>
               </w:rPr>
-              <w:t xml:space="preserve">e)</w:t>
-            </w:r>
-          </w:p>
-        </w:tc>
-        <w:tc>
-          <w:tcPr>
-            <w:tcW w:type="dxa" w:w="7800"/>
+              <w:t xml:space="preserve">5. (b+h)</w:t>
+            </w:r>
+          </w:p>
+        </w:tc>
+        <w:tc>
+          <w:tcPr>
+            <w:tcW w:type="dxa" w:w="7000"/>
             <w:tcBorders>
               <w:top w:val="single" w:color="BFBFBF" w:sz="4"/>
               <w:left w:val="single" w:color="BFBFBF" w:sz="4"/>
@@ -7671,7 +8043,7 @@
                 <w:sz w:val="19"/>
                 <w:szCs w:val="19"/>
               </w:rPr>
-              <w:t xml:space="preserve">Procesos y sus estados (concepto), sin planificadores ni algoritmos.</w:t>
+              <w:t xml:space="preserve">Binario/octal aplicado a permisos: representación binaria y octal (solo lo necesario para permisos) enlazada directamente con permisos de archivos y directorios (introducción; se profundiza en el bloque 5-6, RA4).</w:t>
             </w:r>
           </w:p>
         </w:tc>
@@ -7707,13 +8079,13 @@
                 <w:sz w:val="19"/>
                 <w:szCs w:val="19"/>
               </w:rPr>
-              <w:t xml:space="preserve">f)</w:t>
-            </w:r>
-          </w:p>
-        </w:tc>
-        <w:tc>
-          <w:tcPr>
-            <w:tcW w:type="dxa" w:w="7800"/>
+              <w:t xml:space="preserve">6. (i)</w:t>
+            </w:r>
+          </w:p>
+        </w:tc>
+        <w:tc>
+          <w:tcPr>
+            <w:tcW w:type="dxa" w:w="7000"/>
             <w:tcBorders>
               <w:top w:val="single" w:color="BFBFBF" w:sz="4"/>
               <w:left w:val="single" w:color="BFBFBF" w:sz="4"/>
@@ -7741,213 +8113,7 @@
                 <w:sz w:val="19"/>
                 <w:szCs w:val="19"/>
               </w:rPr>
-              <w:t xml:space="preserve">Estructura y organización del sistema de archivos: jerarquía, rutas.</w:t>
-            </w:r>
-          </w:p>
-        </w:tc>
-      </w:tr>
-      <w:tr>
-        <w:tc>
-          <w:tcPr>
-            <w:tcW w:type="dxa" w:w="1300"/>
-            <w:tcBorders>
-              <w:top w:val="single" w:color="BFBFBF" w:sz="4"/>
-              <w:left w:val="single" w:color="BFBFBF" w:sz="4"/>
-              <w:bottom w:val="single" w:color="BFBFBF" w:sz="4"/>
-              <w:right w:val="single" w:color="BFBFBF" w:sz="4"/>
-            </w:tcBorders>
-            <w:tcMar>
-              <w:top w:type="dxa" w:w="60"/>
-              <w:left w:type="dxa" w:w="100"/>
-              <w:bottom w:type="dxa" w:w="60"/>
-              <w:right w:type="dxa" w:w="100"/>
-            </w:tcMar>
-            <w:vAlign w:val="center"/>
-          </w:tcPr>
-          <w:p>
-            <w:pPr>
-              <w:jc w:val="center"/>
-            </w:pPr>
-            <w:r>
-              <w:rPr>
-                <w:rFonts w:ascii="News Gothic MT" w:cs="News Gothic MT" w:eastAsia="News Gothic MT" w:hAnsi="News Gothic MT"/>
-                <w:b/>
-                <w:bCs/>
-                <w:sz w:val="19"/>
-                <w:szCs w:val="19"/>
-              </w:rPr>
-              <w:t xml:space="preserve">g)</w:t>
-            </w:r>
-          </w:p>
-        </w:tc>
-        <w:tc>
-          <w:tcPr>
-            <w:tcW w:type="dxa" w:w="7800"/>
-            <w:tcBorders>
-              <w:top w:val="single" w:color="BFBFBF" w:sz="4"/>
-              <w:left w:val="single" w:color="BFBFBF" w:sz="4"/>
-              <w:bottom w:val="single" w:color="BFBFBF" w:sz="4"/>
-              <w:right w:val="single" w:color="BFBFBF" w:sz="4"/>
-            </w:tcBorders>
-            <w:tcMar>
-              <w:top w:type="dxa" w:w="60"/>
-              <w:left w:type="dxa" w:w="100"/>
-              <w:bottom w:type="dxa" w:w="60"/>
-              <w:right w:type="dxa" w:w="100"/>
-            </w:tcMar>
-            <w:vAlign w:val="center"/>
-          </w:tcPr>
-          <w:p>
-            <w:pPr>
-              <w:jc w:val="left"/>
-            </w:pPr>
-            <w:r>
-              <w:rPr>
-                <w:rFonts w:ascii="News Gothic MT" w:cs="News Gothic MT" w:eastAsia="News Gothic MT" w:hAnsi="News Gothic MT"/>
-                <w:b w:val="false"/>
-                <w:bCs w:val="false"/>
-                <w:sz w:val="19"/>
-                <w:szCs w:val="19"/>
-              </w:rPr>
-              <w:t xml:space="preserve">Atributos de archivo y directorio en Windows y en Linux.</w:t>
-            </w:r>
-          </w:p>
-        </w:tc>
-      </w:tr>
-      <w:tr>
-        <w:tc>
-          <w:tcPr>
-            <w:tcW w:type="dxa" w:w="1300"/>
-            <w:tcBorders>
-              <w:top w:val="single" w:color="BFBFBF" w:sz="4"/>
-              <w:left w:val="single" w:color="BFBFBF" w:sz="4"/>
-              <w:bottom w:val="single" w:color="BFBFBF" w:sz="4"/>
-              <w:right w:val="single" w:color="BFBFBF" w:sz="4"/>
-            </w:tcBorders>
-            <w:shd w:fill="F2F2F2" w:color="auto" w:val="clear"/>
-            <w:tcMar>
-              <w:top w:type="dxa" w:w="60"/>
-              <w:left w:type="dxa" w:w="100"/>
-              <w:bottom w:type="dxa" w:w="60"/>
-              <w:right w:type="dxa" w:w="100"/>
-            </w:tcMar>
-            <w:vAlign w:val="center"/>
-          </w:tcPr>
-          <w:p>
-            <w:pPr>
-              <w:jc w:val="center"/>
-            </w:pPr>
-            <w:r>
-              <w:rPr>
-                <w:rFonts w:ascii="News Gothic MT" w:cs="News Gothic MT" w:eastAsia="News Gothic MT" w:hAnsi="News Gothic MT"/>
-                <w:b/>
-                <w:bCs/>
-                <w:sz w:val="19"/>
-                <w:szCs w:val="19"/>
-              </w:rPr>
-              <w:t xml:space="preserve">h)</w:t>
-            </w:r>
-          </w:p>
-        </w:tc>
-        <w:tc>
-          <w:tcPr>
-            <w:tcW w:type="dxa" w:w="7800"/>
-            <w:tcBorders>
-              <w:top w:val="single" w:color="BFBFBF" w:sz="4"/>
-              <w:left w:val="single" w:color="BFBFBF" w:sz="4"/>
-              <w:bottom w:val="single" w:color="BFBFBF" w:sz="4"/>
-              <w:right w:val="single" w:color="BFBFBF" w:sz="4"/>
-            </w:tcBorders>
-            <w:shd w:fill="F2F2F2" w:color="auto" w:val="clear"/>
-            <w:tcMar>
-              <w:top w:type="dxa" w:w="60"/>
-              <w:left w:type="dxa" w:w="100"/>
-              <w:bottom w:type="dxa" w:w="60"/>
-              <w:right w:type="dxa" w:w="100"/>
-            </w:tcMar>
-            <w:vAlign w:val="center"/>
-          </w:tcPr>
-          <w:p>
-            <w:pPr>
-              <w:jc w:val="left"/>
-            </w:pPr>
-            <w:r>
-              <w:rPr>
-                <w:rFonts w:ascii="News Gothic MT" w:cs="News Gothic MT" w:eastAsia="News Gothic MT" w:hAnsi="News Gothic MT"/>
-                <w:b w:val="false"/>
-                <w:bCs w:val="false"/>
-                <w:sz w:val="19"/>
-                <w:szCs w:val="19"/>
-              </w:rPr>
-              <w:t xml:space="preserve">Permisos de archivos y directorios (introducción; se profundiza en el bloque 5-6, RA4).</w:t>
-            </w:r>
-          </w:p>
-        </w:tc>
-      </w:tr>
-      <w:tr>
-        <w:tc>
-          <w:tcPr>
-            <w:tcW w:type="dxa" w:w="1300"/>
-            <w:tcBorders>
-              <w:top w:val="single" w:color="BFBFBF" w:sz="4"/>
-              <w:left w:val="single" w:color="BFBFBF" w:sz="4"/>
-              <w:bottom w:val="single" w:color="BFBFBF" w:sz="4"/>
-              <w:right w:val="single" w:color="BFBFBF" w:sz="4"/>
-            </w:tcBorders>
-            <w:tcMar>
-              <w:top w:type="dxa" w:w="60"/>
-              <w:left w:type="dxa" w:w="100"/>
-              <w:bottom w:type="dxa" w:w="60"/>
-              <w:right w:type="dxa" w:w="100"/>
-            </w:tcMar>
-            <w:vAlign w:val="center"/>
-          </w:tcPr>
-          <w:p>
-            <w:pPr>
-              <w:jc w:val="center"/>
-            </w:pPr>
-            <w:r>
-              <w:rPr>
-                <w:rFonts w:ascii="News Gothic MT" w:cs="News Gothic MT" w:eastAsia="News Gothic MT" w:hAnsi="News Gothic MT"/>
-                <w:b/>
-                <w:bCs/>
-                <w:sz w:val="19"/>
-                <w:szCs w:val="19"/>
-              </w:rPr>
-              <w:t xml:space="preserve">i)</w:t>
-            </w:r>
-          </w:p>
-        </w:tc>
-        <w:tc>
-          <w:tcPr>
-            <w:tcW w:type="dxa" w:w="7800"/>
-            <w:tcBorders>
-              <w:top w:val="single" w:color="BFBFBF" w:sz="4"/>
-              <w:left w:val="single" w:color="BFBFBF" w:sz="4"/>
-              <w:bottom w:val="single" w:color="BFBFBF" w:sz="4"/>
-              <w:right w:val="single" w:color="BFBFBF" w:sz="4"/>
-            </w:tcBorders>
-            <w:tcMar>
-              <w:top w:type="dxa" w:w="60"/>
-              <w:left w:type="dxa" w:w="100"/>
-              <w:bottom w:type="dxa" w:w="60"/>
-              <w:right w:type="dxa" w:w="100"/>
-            </w:tcMar>
-            <w:vAlign w:val="center"/>
-          </w:tcPr>
-          <w:p>
-            <w:pPr>
-              <w:jc w:val="left"/>
-            </w:pPr>
-            <w:r>
-              <w:rPr>
-                <w:rFonts w:ascii="News Gothic MT" w:cs="News Gothic MT" w:eastAsia="News Gothic MT" w:hAnsi="News Gothic MT"/>
-                <w:b w:val="false"/>
-                <w:bCs w:val="false"/>
-                <w:sz w:val="19"/>
-                <w:szCs w:val="19"/>
-              </w:rPr>
-              <w:t xml:space="preserve">Sistemas transaccionales: concepto y journaling en ext4/NTFS.</w:t>
+              <w:t xml:space="preserve">Sistemas transaccionales: cierre breve — concepto y journaling en ext4/NTFS, y su relevancia al elegir un sistema de archivos.</w:t>
             </w:r>
           </w:p>
         </w:tc>

</xml_diff>